<commit_message>
Add 2025 backstory scenes, records-facility confrontation, Kelana extraction; flip Ch14 exchange; reach 95k words
Co-Authored-By: Claude Sonnet 5.5 <noreply@anthropic.com>

Claude-Session: https://claude.ai/code/session_011sBVAmX35tPxqRASXqkfKn
</commit_message>
<xml_diff>
--- a/01_The_Blue_Silence/Manuscript/THE_BLUE_SILENCE_Chapter_13_ORION.docx
+++ b/01_The_Blue_Silence/Manuscript/THE_BLUE_SILENCE_Chapter_13_ORION.docx
@@ -60,7 +60,71 @@
         <w:jc w:val="left"/>
       </w:pPr>
       <w:r>
-        <w:t>A warehouse in the eastern industrial belt of Kota Aruna had been under surveillance for six weeks. The target package was finalised at 18:40. Entry teams moved at 22:00.</w:t>
+        <w:t>March 2025. It rained that night, as it seemed to whenever the police arrived second.</w:t>
+      </w:r>
+    </w:p>
+    <w:p>
+      <w:pPr>
+        <w:jc w:val="left"/>
+      </w:pPr>
+      <w:r>
+        <w:t>A warehouse in the eastern industrial belt of Kota Aruna had been under surveillance for six weeks. The target package was finalised at 18:40. Entry teams moved at 21:45.</w:t>
+      </w:r>
+    </w:p>
+    <w:p>
+      <w:pPr>
+        <w:jc w:val="left"/>
+      </w:pPr>
+      <w:r>
+        <w:t>Rahman stood at the command post two hundred metres back, beneath a tarpaulin that did not quite meet its frame, and listened to the radio.</w:t>
+      </w:r>
+    </w:p>
+    <w:p>
+      <w:pPr>
+        <w:jc w:val="left"/>
+      </w:pPr>
+      <w:r>
+        <w:t>“Main entry open.”</w:t>
+      </w:r>
+    </w:p>
+    <w:p>
+      <w:pPr>
+        <w:jc w:val="left"/>
+      </w:pPr>
+      <w:r>
+        <w:t>“Ground floor clear.”</w:t>
+      </w:r>
+    </w:p>
+    <w:p>
+      <w:pPr>
+        <w:jc w:val="left"/>
+      </w:pPr>
+      <w:r>
+        <w:t>“Annex clear.”</w:t>
+      </w:r>
+    </w:p>
+    <w:p>
+      <w:pPr>
+        <w:jc w:val="left"/>
+      </w:pPr>
+      <w:r>
+        <w:t>Then a pause long enough to be heard.</w:t>
+      </w:r>
+    </w:p>
+    <w:p>
+      <w:pPr>
+        <w:jc w:val="left"/>
+      </w:pPr>
+      <w:r>
+        <w:t>“Dato’. There is nobody here.”</w:t>
+      </w:r>
+    </w:p>
+    <w:p>
+      <w:pPr>
+        <w:jc w:val="left"/>
+      </w:pPr>
+      <w:r>
+        <w:t>He walked in himself.</w:t>
       </w:r>
     </w:p>
     <w:p>
@@ -116,6 +180,62 @@
         <w:jc w:val="left"/>
       </w:pPr>
       <w:r>
+        <w:t>A pot sat on a portable stove beside four plates. Rahman held his palm over one without touching it, as he had once done in a warehouse in the North Corridor, in the rain, twenty-five years earlier, with Harun watching.</w:t>
+      </w:r>
+    </w:p>
+    <w:p>
+      <w:pPr>
+        <w:jc w:val="left"/>
+      </w:pPr>
+      <w:r>
+        <w:t>Warm. Not hot.</w:t>
+      </w:r>
+    </w:p>
+    <w:p>
+      <w:pPr>
+        <w:jc w:val="left"/>
+      </w:pPr>
+      <w:r>
+        <w:t>He did not tell the team why he had done it. Nobody under fifty would have understood.</w:t>
+      </w:r>
+    </w:p>
+    <w:p>
+      <w:pPr>
+        <w:jc w:val="left"/>
+      </w:pPr>
+      <w:r>
+        <w:t>Superintendent Rafiq Hamdan crossed the floor with his helmet under his arm.</w:t>
+      </w:r>
+    </w:p>
+    <w:p>
+      <w:pPr>
+        <w:jc w:val="left"/>
+      </w:pPr>
+      <w:r>
+        <w:t>“The package was final at 18:40,” Rafiq said. “Nobody outside the planning room had the address.”</w:t>
+      </w:r>
+    </w:p>
+    <w:p>
+      <w:pPr>
+        <w:jc w:val="left"/>
+      </w:pPr>
+      <w:r>
+        <w:t>“Then somebody inside the planning room did.”</w:t>
+      </w:r>
+    </w:p>
+    <w:p>
+      <w:pPr>
+        <w:jc w:val="left"/>
+      </w:pPr>
+      <w:r>
+        <w:t>Rafiq did not argue.</w:t>
+      </w:r>
+    </w:p>
+    <w:p>
+      <w:pPr>
+        <w:jc w:val="left"/>
+      </w:pPr>
+      <w:r>
         <w:t>The access audit later showed a valid police credential had opened the final target annex ninety-four minutes before the raid.</w:t>
       </w:r>
     </w:p>
@@ -164,6 +284,102 @@
         <w:jc w:val="left"/>
       </w:pPr>
       <w:r>
+        <w:t>Rahman believed him.</w:t>
+      </w:r>
+    </w:p>
+    <w:p>
+      <w:pPr>
+        <w:jc w:val="left"/>
+      </w:pPr>
+      <w:r>
+        <w:t>That was the problem. He had begun to believe all of them.</w:t>
+      </w:r>
+    </w:p>
+    <w:p>
+      <w:pPr>
+        <w:jc w:val="left"/>
+      </w:pPr>
+      <w:r>
+        <w:t>He wrote the incident report himself, at his own kitchen table, at three in the morning, because the building had stopped feeling like a place where reports were read only by the people they were addressed to.</w:t>
+      </w:r>
+    </w:p>
+    <w:p>
+      <w:pPr>
+        <w:jc w:val="left"/>
+      </w:pPr>
+      <w:r>
+        <w:t>Under Cause he wrote: Unknown.</w:t>
+      </w:r>
+    </w:p>
+    <w:p>
+      <w:pPr>
+        <w:jc w:val="left"/>
+      </w:pPr>
+      <w:r>
+        <w:t>Under Responsible Officer he wrote his own name.</w:t>
+      </w:r>
+    </w:p>
+    <w:p>
+      <w:pPr>
+        <w:jc w:val="left"/>
+      </w:pPr>
+      <w:r>
+        <w:t>It was not required. It was not even wise. Mariam found it in the morning and read it standing at the counter with her coffee, then put it back exactly where it had been.</w:t>
+      </w:r>
+    </w:p>
+    <w:p>
+      <w:pPr>
+        <w:jc w:val="left"/>
+      </w:pPr>
+      <w:r>
+        <w:t>“Nobody asked you for that,” she said.</w:t>
+      </w:r>
+    </w:p>
+    <w:p>
+      <w:pPr>
+        <w:jc w:val="left"/>
+      </w:pPr>
+      <w:r>
+        <w:t>“I know.”</w:t>
+      </w:r>
+    </w:p>
+    <w:p>
+      <w:pPr>
+        <w:jc w:val="left"/>
+      </w:pPr>
+      <w:r>
+        <w:t>“It will be used.”</w:t>
+      </w:r>
+    </w:p>
+    <w:p>
+      <w:pPr>
+        <w:jc w:val="left"/>
+      </w:pPr>
+      <w:r>
+        <w:t>“By whom?”</w:t>
+      </w:r>
+    </w:p>
+    <w:p>
+      <w:pPr>
+        <w:jc w:val="left"/>
+      </w:pPr>
+      <w:r>
+        <w:t>She looked at him for a long time.</w:t>
+      </w:r>
+    </w:p>
+    <w:p>
+      <w:pPr>
+        <w:jc w:val="left"/>
+      </w:pPr>
+      <w:r>
+        <w:t>“That,” she said, “is what I thought you would say.”</w:t>
+      </w:r>
+    </w:p>
+    <w:p>
+      <w:pPr>
+        <w:jc w:val="left"/>
+      </w:pPr>
+      <w:r>
         <w:t>The second failure was Salmah Yusof.</w:t>
       </w:r>
     </w:p>
@@ -212,47 +428,79 @@
         <w:jc w:val="left"/>
       </w:pPr>
       <w:r>
-        <w:t>On the morning of transfer, Salmah never reached the safe location.</w:t>
-      </w:r>
-    </w:p>
-    <w:p>
-      <w:pPr>
-        <w:jc w:val="left"/>
-      </w:pPr>
-      <w:r>
-        <w:t>Her escort vehicle arrived at the pickup point.</w:t>
-      </w:r>
-    </w:p>
-    <w:p>
-      <w:pPr>
-        <w:jc w:val="left"/>
-      </w:pPr>
-      <w:r>
-        <w:t>She did not.</w:t>
-      </w:r>
-    </w:p>
-    <w:p>
-      <w:pPr>
-        <w:jc w:val="left"/>
-      </w:pPr>
-      <w:r>
-        <w:t>Her temporary apartment had been cleaned.</w:t>
-      </w:r>
-    </w:p>
-    <w:p>
-      <w:pPr>
-        <w:jc w:val="left"/>
-      </w:pPr>
-      <w:r>
-        <w:t>Phone left behind.</w:t>
-      </w:r>
-    </w:p>
-    <w:p>
-      <w:pPr>
-        <w:jc w:val="left"/>
-      </w:pPr>
-      <w:r>
-        <w:t>No sign of struggle.</w:t>
+        <w:t>On the morning of transfer, the escort vehicle reached the pickup point at 05:50.</w:t>
+      </w:r>
+    </w:p>
+    <w:p>
+      <w:pPr>
+        <w:jc w:val="left"/>
+      </w:pPr>
+      <w:r>
+        <w:t>Two officers. An unmarked Proton. A thermos of coffee between them, because the job was usually boring and had been boring for nine days.</w:t>
+      </w:r>
+    </w:p>
+    <w:p>
+      <w:pPr>
+        <w:jc w:val="left"/>
+      </w:pPr>
+      <w:r>
+        <w:t>Salmah did not come down.</w:t>
+      </w:r>
+    </w:p>
+    <w:p>
+      <w:pPr>
+        <w:jc w:val="left"/>
+      </w:pPr>
+      <w:r>
+        <w:t>At 06:05 the senior officer rang the apartment. At 06:10 he rang again. At 06:14 he took the stairs two at a time with his hand on his holster for the first time in nine days.</w:t>
+      </w:r>
+    </w:p>
+    <w:p>
+      <w:pPr>
+        <w:jc w:val="left"/>
+      </w:pPr>
+      <w:r>
+        <w:t>The door was unlocked.</w:t>
+      </w:r>
+    </w:p>
+    <w:p>
+      <w:pPr>
+        <w:jc w:val="left"/>
+      </w:pPr>
+      <w:r>
+        <w:t>The apartment had been cleaned.</w:t>
+      </w:r>
+    </w:p>
+    <w:p>
+      <w:pPr>
+        <w:jc w:val="left"/>
+      </w:pPr>
+      <w:r>
+        <w:t>Not searched. Cleaned. Surfaces wiped, bed stripped, the bin emptied and its bag taken away. Her phone sat in the centre of the kitchen table, charged to full, face up, like a gift.</w:t>
+      </w:r>
+    </w:p>
+    <w:p>
+      <w:pPr>
+        <w:jc w:val="left"/>
+      </w:pPr>
+      <w:r>
+        <w:t>No struggle.</w:t>
+      </w:r>
+    </w:p>
+    <w:p>
+      <w:pPr>
+        <w:jc w:val="left"/>
+      </w:pPr>
+      <w:r>
+        <w:t>No sign of anything at all.</w:t>
+      </w:r>
+    </w:p>
+    <w:p>
+      <w:pPr>
+        <w:jc w:val="left"/>
+      </w:pPr>
+      <w:r>
+        <w:t>Rahman arrived at 07:40 and stood in the doorway for a long time. He was not allowed to touch the phone for another two hours.</w:t>
       </w:r>
     </w:p>
     <w:p>
@@ -316,6 +564,94 @@
         <w:jc w:val="left"/>
       </w:pPr>
       <w:r>
+        <w:t>Rahman had spoken to him once, on the Thursday.</w:t>
+      </w:r>
+    </w:p>
+    <w:p>
+      <w:pPr>
+        <w:jc w:val="left"/>
+      </w:pPr>
+      <w:r>
+        <w:t>Hafiz had called the private line, which he should not have had.</w:t>
+      </w:r>
+    </w:p>
+    <w:p>
+      <w:pPr>
+        <w:jc w:val="left"/>
+      </w:pPr>
+      <w:r>
+        <w:t>“Dato’, I would rather say this in person.”</w:t>
+      </w:r>
+    </w:p>
+    <w:p>
+      <w:pPr>
+        <w:jc w:val="left"/>
+      </w:pPr>
+      <w:r>
+        <w:t>“Say it now.”</w:t>
+      </w:r>
+    </w:p>
+    <w:p>
+      <w:pPr>
+        <w:jc w:val="left"/>
+      </w:pPr>
+      <w:r>
+        <w:t>“Someone inside knows which consignments we are watching. Not guesses. Knows.”</w:t>
+      </w:r>
+    </w:p>
+    <w:p>
+      <w:pPr>
+        <w:jc w:val="left"/>
+      </w:pPr>
+      <w:r>
+        <w:t>Rahman had looked at the clock. A budget meeting in eleven minutes.</w:t>
+      </w:r>
+    </w:p>
+    <w:p>
+      <w:pPr>
+        <w:jc w:val="left"/>
+      </w:pPr>
+      <w:r>
+        <w:t>“Come Monday,” he said. “Bring everything.”</w:t>
+      </w:r>
+    </w:p>
+    <w:p>
+      <w:pPr>
+        <w:jc w:val="left"/>
+      </w:pPr>
+      <w:r>
+        <w:t>“Monday,” Hafiz agreed.</w:t>
+      </w:r>
+    </w:p>
+    <w:p>
+      <w:pPr>
+        <w:jc w:val="left"/>
+      </w:pPr>
+      <w:r>
+        <w:t>He died on Saturday.</w:t>
+      </w:r>
+    </w:p>
+    <w:p>
+      <w:pPr>
+        <w:jc w:val="left"/>
+      </w:pPr>
+      <w:r>
+        <w:t>At the funeral Rahman stood at the back, in the heat, under a borrowed umbrella. Hafiz’s mother asked him what had been supposed to happen on Monday. He told her it was only a meeting.</w:t>
+      </w:r>
+    </w:p>
+    <w:p>
+      <w:pPr>
+        <w:jc w:val="left"/>
+      </w:pPr>
+      <w:r>
+        <w:t>It was the first lie he had ever told a grieving woman. He did not yet know that it would not be the last.</w:t>
+      </w:r>
+    </w:p>
+    <w:p>
+      <w:pPr>
+        <w:jc w:val="left"/>
+      </w:pPr>
+      <w:r>
         <w:t>The sequence never satisfied Rahman.</w:t>
       </w:r>
     </w:p>
@@ -397,6 +733,94 @@
       </w:pPr>
       <w:r>
         <w:t>That was why ORION existed.</w:t>
+      </w:r>
+    </w:p>
+    <w:p>
+      <w:pPr>
+        <w:jc w:val="left"/>
+      </w:pPr>
+      <w:r>
+        <w:t>Farid asked for him on a Sunday, at his own house, on a veranda behind a hedge of hibiscus.</w:t>
+      </w:r>
+    </w:p>
+    <w:p>
+      <w:pPr>
+        <w:jc w:val="left"/>
+      </w:pPr>
+      <w:r>
+        <w:t>There was tea. There were no aides.</w:t>
+      </w:r>
+    </w:p>
+    <w:p>
+      <w:pPr>
+        <w:jc w:val="left"/>
+      </w:pPr>
+      <w:r>
+        <w:t>“Three failures and no mole,” Farid said. “Six directors who would each like to investigate the other five. I need one commander who will log his own mistakes.”</w:t>
+      </w:r>
+    </w:p>
+    <w:p>
+      <w:pPr>
+        <w:jc w:val="left"/>
+      </w:pPr>
+      <w:r>
+        <w:t>“That is not a compliment.”</w:t>
+      </w:r>
+    </w:p>
+    <w:p>
+      <w:pPr>
+        <w:jc w:val="left"/>
+      </w:pPr>
+      <w:r>
+        <w:t>“It is the only qualification I trust.”</w:t>
+      </w:r>
+    </w:p>
+    <w:p>
+      <w:pPr>
+        <w:jc w:val="left"/>
+      </w:pPr>
+      <w:r>
+        <w:t>Rahman turned the cup in its saucer.</w:t>
+      </w:r>
+    </w:p>
+    <w:p>
+      <w:pPr>
+        <w:jc w:val="left"/>
+      </w:pPr>
+      <w:r>
+        <w:t>“And if what you are looking for is in your own office?”</w:t>
+      </w:r>
+    </w:p>
+    <w:p>
+      <w:pPr>
+        <w:jc w:val="left"/>
+      </w:pPr>
+      <w:r>
+        <w:t>Farid did not blink.</w:t>
+      </w:r>
+    </w:p>
+    <w:p>
+      <w:pPr>
+        <w:jc w:val="left"/>
+      </w:pPr>
+      <w:r>
+        <w:t>“Then you will put me on the list. I would think less of you if you did not.”</w:t>
+      </w:r>
+    </w:p>
+    <w:p>
+      <w:pPr>
+        <w:jc w:val="left"/>
+      </w:pPr>
+      <w:r>
+        <w:t>Rahman said yes.</w:t>
+      </w:r>
+    </w:p>
+    <w:p>
+      <w:pPr>
+        <w:jc w:val="left"/>
+      </w:pPr>
+      <w:r>
+        <w:t>He would remember afterwards how easy it had been. How reasonable the man across the table had sounded. How the veranda smelled of rain on hot stone, and how, for the length of one cup of tea, he had felt entirely safe.</w:t>
       </w:r>
     </w:p>
     <w:p>

</xml_diff>